<commit_message>
Galatians MSG audit: ch1 header moved to 6-9, removed 2 invented headers (ch4/ch6), fixed ch4 title typo, msg_ranges normalized, DOCX rebuilt+reuploaded
</commit_message>
<xml_diff>
--- a/gdocs_build/Galatians.docx
+++ b/gdocs_build/Galatians.docx
@@ -90,8 +90,18 @@
             <w:r/>
             <w:r>
               <w:rPr>
+                <w:b/>
+                <w:sz w:val="16"/>
+              </w:rPr>
+              <w:t>1-5</w:t>
+            </w:r>
+          </w:p>
+          <w:p>
+            <w:r>
+              <w:rPr>
                 <w:sz w:val="18"/>
               </w:rPr>
+              <w:t>I, Paul, and my companions in faith here, send greetings to the Galatian churches. My authority for writing to you does not come from any popular vote of the people, nor does it come through the appointment of some human higher-up. It comes directly from Jesus the Messiah and God the Father, who raised him from the dead. I’m God-commissioned. So I greet you with the great words, grace and peace! We know the meaning of those words because Jesus Christ rescued us from this evil world we’re in by offering himself as a sacrifice for our sins. God’s plan is that we all experience that rescue. Glory to God forever! Oh, yes!</w:t>
             </w:r>
           </w:p>
         </w:tc>
@@ -112,10 +122,9 @@
           <w:p>
             <w:r>
               <w:rPr>
-                <w:b/>
                 <w:sz w:val="18"/>
               </w:rPr>
-              <w:t>The Real Message</w:t>
+              <w:t>What's up, Galatia! It's Paul, and my whole crew here in the faith is sending greetings to the Galatian churches. Just so we're clear, my authority for writing this doesn't come from some popularity contest or from getting appointed by some important human higher-up. It comes directly from Jesus the Messiah and God the Father, who raised him from the dead. I'm God-commissioned. So I'm greeting you with the great words — grace and peace! We know what those words mean, because Jesus Christ rescued us from this messed-up world by offering himself as a sacrifice for our sins. God's plan is that we all experience that rescue. Glory to God forever! Oh, yes!</w:t>
             </w:r>
           </w:p>
         </w:tc>
@@ -136,10 +145,9 @@
           <w:p>
             <w:r>
               <w:rPr>
-                <w:b/>
                 <w:sz w:val="18"/>
               </w:rPr>
-              <w:t>진짜 메시지</w:t>
+              <w:t>갈라디아 친구들, 잘 지내? 나 바울이야. 여기 있는 믿음의 친구들과 함께 갈라디아 여러 교회에 안부를 전해. 확실히 해둘게 — 내가 이 편지를 쓰는 건 인기 투표에서 이겨서가 아니고, 어떤 높은 사람한테 임명받아서도 아니야. 내 권한은 예수 그리스도와, 예수님을 죽은 자들 가운데서 살리신 하나님 아버지께 직접 받은 거야. 나는 하나님께 직접 임명받은 사람이야. 그래서 너희에게 위대한 인사말을 전하는 거야 — 은혜와 평화가 있기를! 이 말이 무슨 뜻인지 우리는 알아. 예수 그리스도께서 우리 죄를 위해 자신을 희생 제물로 바치심으로 이 험한 세상에서 우리를 구해 주셨기 때문이야. 우리 모두가 그 구원을 경험하는 게 하나님의 계획이야. 하나님께 영원히 영광을! 정말이야!</w:t>
             </w:r>
           </w:p>
         </w:tc>
@@ -153,18 +161,8 @@
             <w:r/>
             <w:r>
               <w:rPr>
-                <w:b/>
-                <w:sz w:val="16"/>
-              </w:rPr>
-              <w:t>1-5</w:t>
-            </w:r>
-          </w:p>
-          <w:p>
-            <w:r>
-              <w:rPr>
                 <w:sz w:val="18"/>
               </w:rPr>
-              <w:t>I, Paul, and my companions in faith here, send greetings to the Galatian churches. My authority for writing to you does not come from any popular vote of the people, nor does it come through the appointment of some human higher-up. It comes directly from Jesus the Messiah and God the Father, who raised him from the dead. I’m God-commissioned. So I greet you with the great words, grace and peace! We know the meaning of those words because Jesus Christ rescued us from this evil world we’re in by offering himself as a sacrifice for our sins. God’s plan is that we all experience that rescue. Glory to God forever! Oh, yes!</w:t>
             </w:r>
           </w:p>
         </w:tc>
@@ -179,15 +177,16 @@
                 <w:b/>
                 <w:sz w:val="16"/>
               </w:rPr>
-              <w:t>1-5</w:t>
-            </w:r>
-          </w:p>
-          <w:p>
-            <w:r>
-              <w:rPr>
+              <w:t>6-9</w:t>
+            </w:r>
+          </w:p>
+          <w:p>
+            <w:r>
+              <w:rPr>
+                <w:b/>
                 <w:sz w:val="18"/>
               </w:rPr>
-              <w:t>What's up, Galatia! It's Paul, and my whole crew here in the faith is sending greetings to the Galatian churches. Just so we're clear, my authority for writing this doesn't come from some popularity contest or from getting appointed by some important human higher-up. It comes directly from Jesus the Messiah and God the Father, who raised him from the dead. I'm God-commissioned. So I'm greeting you with the great words — grace and peace! We know what those words mean, because Jesus Christ rescued us from this messed-up world by offering himself as a sacrifice for our sins. God's plan is that we all experience that rescue. Glory to God forever! Oh, yes!</w:t>
+              <w:t>The Real Message</w:t>
             </w:r>
           </w:p>
         </w:tc>
@@ -202,15 +201,16 @@
                 <w:b/>
                 <w:sz w:val="16"/>
               </w:rPr>
-              <w:t>1-5</w:t>
-            </w:r>
-          </w:p>
-          <w:p>
-            <w:r>
-              <w:rPr>
+              <w:t>6-9</w:t>
+            </w:r>
+          </w:p>
+          <w:p>
+            <w:r>
+              <w:rPr>
+                <w:b/>
                 <w:sz w:val="18"/>
               </w:rPr>
-              <w:t>갈라디아 친구들, 잘 지내? 나 바울이야. 여기 있는 믿음의 친구들과 함께 갈라디아 여러 교회에 안부를 전해. 확실히 해둘게 — 내가 이 편지를 쓰는 건 인기 투표에서 이겨서가 아니고, 어떤 높은 사람한테 임명받아서도 아니야. 내 권한은 예수 그리스도와, 예수님을 죽은 자들 가운데서 살리신 하나님 아버지께 직접 받은 거야. 나는 하나님께 직접 임명받은 사람이야. 그래서 너희에게 위대한 인사말을 전하는 거야 — 은혜와 평화가 있기를! 이 말이 무슨 뜻인지 우리는 알아. 예수 그리스도께서 우리 죄를 위해 자신을 희생 제물로 바치심으로 이 험한 세상에서 우리를 구해 주셨기 때문이야. 우리 모두가 그 구원을 경험하는 게 하나님의 계획이야. 하나님께 영원히 영광을! 정말이야!</w:t>
+              <w:t>진짜 메시지</w:t>
             </w:r>
           </w:p>
         </w:tc>
@@ -2390,7 +2390,7 @@
         <w:pStyle w:val="Heading1"/>
       </w:pPr>
       <w:r>
-        <w:t>Chapter 4 — From Kid to honored</w:t>
+        <w:t>Chapter 4 — From Kid to Heir</w:t>
       </w:r>
     </w:p>
     <w:tbl>
@@ -2447,69 +2447,6 @@
                 <w:sz w:val="20"/>
               </w:rPr>
               <w:t>Teen 한국어</w:t>
-            </w:r>
-          </w:p>
-        </w:tc>
-      </w:tr>
-      <w:tr>
-        <w:tc>
-          <w:tcPr>
-            <w:tcW w:type="dxa" w:w="2880"/>
-          </w:tcPr>
-          <w:p>
-            <w:r/>
-            <w:r>
-              <w:rPr>
-                <w:sz w:val="18"/>
-              </w:rPr>
-            </w:r>
-          </w:p>
-        </w:tc>
-        <w:tc>
-          <w:tcPr>
-            <w:tcW w:type="dxa" w:w="2880"/>
-          </w:tcPr>
-          <w:p>
-            <w:r/>
-            <w:r>
-              <w:rPr>
-                <w:b/>
-                <w:sz w:val="16"/>
-              </w:rPr>
-              <w:t>1-3</w:t>
-            </w:r>
-          </w:p>
-          <w:p>
-            <w:r>
-              <w:rPr>
-                <w:b/>
-                <w:sz w:val="18"/>
-              </w:rPr>
-              <w:t>Children of God</w:t>
-            </w:r>
-          </w:p>
-        </w:tc>
-        <w:tc>
-          <w:tcPr>
-            <w:tcW w:type="dxa" w:w="2880"/>
-          </w:tcPr>
-          <w:p>
-            <w:r/>
-            <w:r>
-              <w:rPr>
-                <w:b/>
-                <w:sz w:val="16"/>
-              </w:rPr>
-              <w:t>1-3</w:t>
-            </w:r>
-          </w:p>
-          <w:p>
-            <w:r>
-              <w:rPr>
-                <w:b/>
-                <w:sz w:val="18"/>
-              </w:rPr>
-              <w:t>하나님의 자녀</w:t>
             </w:r>
           </w:p>
         </w:tc>
@@ -4285,69 +4222,6 @@
                 <w:sz w:val="18"/>
               </w:rPr>
               <w:t>네가 어떤 사람인지, 너에게 맡겨진 일이 뭔지 신중하게 살펴보고, 그 일에 푹 빠져. 잘난 척하지 마. 남과 비교하지 마. 너희 각자는 자기 삶으로 할 수 있는 최고의 창조적인 일을 할 책임이 있어.</w:t>
-            </w:r>
-          </w:p>
-        </w:tc>
-      </w:tr>
-      <w:tr>
-        <w:tc>
-          <w:tcPr>
-            <w:tcW w:type="dxa" w:w="2880"/>
-          </w:tcPr>
-          <w:p>
-            <w:r/>
-            <w:r>
-              <w:rPr>
-                <w:sz w:val="18"/>
-              </w:rPr>
-            </w:r>
-          </w:p>
-        </w:tc>
-        <w:tc>
-          <w:tcPr>
-            <w:tcW w:type="dxa" w:w="2880"/>
-          </w:tcPr>
-          <w:p>
-            <w:r/>
-            <w:r>
-              <w:rPr>
-                <w:b/>
-                <w:sz w:val="16"/>
-              </w:rPr>
-              <w:t>6</w:t>
-            </w:r>
-          </w:p>
-          <w:p>
-            <w:r>
-              <w:rPr>
-                <w:b/>
-                <w:sz w:val="18"/>
-              </w:rPr>
-              <w:t>Do Good to Everyone</w:t>
-            </w:r>
-          </w:p>
-        </w:tc>
-        <w:tc>
-          <w:tcPr>
-            <w:tcW w:type="dxa" w:w="2880"/>
-          </w:tcPr>
-          <w:p>
-            <w:r/>
-            <w:r>
-              <w:rPr>
-                <w:b/>
-                <w:sz w:val="16"/>
-              </w:rPr>
-              <w:t>6</w:t>
-            </w:r>
-          </w:p>
-          <w:p>
-            <w:r>
-              <w:rPr>
-                <w:b/>
-                <w:sz w:val="18"/>
-              </w:rPr>
-              <w:t>모두에게 선을 행해</w:t>
             </w:r>
           </w:p>
         </w:tc>

</xml_diff>

<commit_message>
Galatians 3차 심층 검수: EN+KO 1건 수정 (4:8-11 'is going up in a puff of smoke' → 'has gone up in a puff of smoke', MSG 현재완료 'has gone up' 시제 정정; KO '사라질까 봐' → '사라져 버린 건 아닐까') — 역방향 추가 없음(육의 열매 15개·성령의 열매 9개·숫자 전부 MSG 정합), 인명 일관성 확인, validator PASS·빌드 VERIFY OK·pairing 55행 OK·독스 재업로드 export-back VERIFIED OK
</commit_message>
<xml_diff>
--- a/gdocs_build/Galatians.docx
+++ b/gdocs_build/Galatians.docx
@@ -2564,7 +2564,7 @@
               <w:rPr>
                 <w:sz w:val="18"/>
               </w:rPr>
-              <w:t>Earlier, before you knew God personally, you were enslaved to so-called gods that had nothing divine about them. But now that you know the real God — or rather, since God knows you — how can you possibly go back and subject yourselves to those tin gods? Because that's exactly what you're doing when you get intimidated into scrupulously observing all the traditions, taboos, and superstitions tied to special days and seasons and years. I'm afraid all my hard work among you is going up in a puff of smoke!</w:t>
+              <w:t>Earlier, before you knew God personally, you were enslaved to so-called gods that had nothing divine about them. But now that you know the real God — or rather, since God knows you — how can you possibly go back and subject yourselves to those tin gods? Because that's exactly what you're doing when you get intimidated into scrupulously observing all the traditions, taboos, and superstitions tied to special days and seasons and years. I'm afraid that all my hard work among you has gone up in a puff of smoke!</w:t>
             </w:r>
           </w:p>
         </w:tc>
@@ -2587,7 +2587,7 @@
               <w:rPr>
                 <w:sz w:val="18"/>
               </w:rPr>
-              <w:t>예전에 너희가 하나님을 개인적으로 알기 전에는, 신적인 것이라고는 하나도 없는 이른바 신들에게 노예처럼 묶여 있었어. 그런데 이제 진짜 하나님을 알게 됐잖아 — 아니, 사실은 하나님이 너희를 아시게 된 거지. 그런데 어떻게 다시 그깟 허수아비 신들에게 굽신거릴 수 있어? 특별한 날과 절기와 해에 얽힌 온갖 전통과 금기와 미신을 무서워서 꼼꼼히 지키는 게 바로 그 짓이거든. 너희 가운데서 내가 한 모든 수고가 연기처럼 사라질까 봐 걱정돼!</w:t>
+              <w:t>예전에 너희가 하나님을 개인적으로 알기 전에는, 신적인 것이라고는 하나도 없는 이른바 신들에게 노예처럼 묶여 있었어. 그런데 이제 진짜 하나님을 알게 됐잖아 — 아니, 사실은 하나님이 너희를 아시게 된 거지. 그런데 어떻게 다시 그깟 허수아비 신들에게 굽신거릴 수 있어? 특별한 날과 절기와 해에 얽힌 온갖 전통과 금기와 미신을 무서워서 꼼꼼히 지키는 게 바로 그 짓이거든. 너희 가운데서 내가 한 모든 수고가 연기처럼 사라져 버린 건 아닐까 걱정돼!</w:t>
             </w:r>
           </w:p>
         </w:tc>

</xml_diff>